<commit_message>
first commit for lab 6
</commit_message>
<xml_diff>
--- a/DB/Lab1/Лаба1.docx
+++ b/DB/Lab1/Лаба1.docx
@@ -2702,20 +2702,12 @@
         <w:rPr>
           <w:sz w:val="22"/>
           <w:szCs w:val="22"/>
-        </w:rPr>
-      </w:pPr>
-    </w:p>
-    <w:p>
-      <w:pPr>
-        <w:spacing w:after="0"/>
-        <w:rPr>
-          <w:sz w:val="22"/>
-          <w:szCs w:val="22"/>
           <w:lang w:val="en-US"/>
         </w:rPr>
       </w:pPr>
       <w:r>
         <w:rPr>
+          <w:noProof/>
           <w:sz w:val="22"/>
           <w:szCs w:val="22"/>
           <w:lang w:val="en-US"/>
@@ -2777,14 +2769,15 @@
       </w:pPr>
       <w:r>
         <w:rPr>
+          <w:noProof/>
           <w:sz w:val="22"/>
           <w:szCs w:val="22"/>
           <w:lang w:val="en-US"/>
         </w:rPr>
         <w:drawing>
-          <wp:inline distT="0" distB="0" distL="0" distR="0" wp14:anchorId="58DDFC3B" wp14:editId="64E8D8A3">
-            <wp:extent cx="5416658" cy="4398647"/>
-            <wp:effectExtent l="0" t="0" r="0" b="1905"/>
+          <wp:inline distT="0" distB="0" distL="0" distR="0" wp14:anchorId="58DDFC3B" wp14:editId="072AB808">
+            <wp:extent cx="5422942" cy="4403750"/>
+            <wp:effectExtent l="0" t="0" r="6350" b="0"/>
             <wp:docPr id="206598773" name="Рисунок 1"/>
             <wp:cNvGraphicFramePr>
               <a:graphicFrameLocks xmlns:a="http://schemas.openxmlformats.org/drawingml/2006/main" noChangeAspect="1"/>
@@ -2805,7 +2798,7 @@
                   <pic:spPr>
                     <a:xfrm>
                       <a:off x="0" y="0"/>
-                      <a:ext cx="5469450" cy="4441517"/>
+                      <a:ext cx="5425005" cy="4405425"/>
                     </a:xfrm>
                     <a:prstGeom prst="rect">
                       <a:avLst/>
@@ -2866,32 +2859,42 @@
       </w:r>
     </w:p>
     <w:p>
-      <w:r>
+      <w:pPr>
+        <w:rPr>
+          <w:rFonts w:ascii="Times New Roman" w:hAnsi="Times New Roman" w:cs="Times New Roman"/>
+        </w:rPr>
+      </w:pPr>
+      <w:r>
+        <w:rPr>
+          <w:rFonts w:ascii="Times New Roman" w:hAnsi="Times New Roman" w:cs="Times New Roman"/>
+        </w:rPr>
         <w:t xml:space="preserve">Во время выполнения лабораторной я узнал основные команды </w:t>
       </w:r>
       <w:r>
         <w:rPr>
+          <w:rFonts w:ascii="Times New Roman" w:hAnsi="Times New Roman" w:cs="Times New Roman"/>
           <w:lang w:val="en-US"/>
         </w:rPr>
         <w:t>DDL</w:t>
       </w:r>
       <w:r>
-        <w:t xml:space="preserve"> </w:t>
-      </w:r>
-      <w:r>
-        <w:t xml:space="preserve">и </w:t>
-      </w:r>
-      <w:r>
-        <w:rPr>
+        <w:rPr>
+          <w:rFonts w:ascii="Times New Roman" w:hAnsi="Times New Roman" w:cs="Times New Roman"/>
+        </w:rPr>
+        <w:t xml:space="preserve"> и </w:t>
+      </w:r>
+      <w:r>
+        <w:rPr>
+          <w:rFonts w:ascii="Times New Roman" w:hAnsi="Times New Roman" w:cs="Times New Roman"/>
           <w:lang w:val="en-US"/>
         </w:rPr>
         <w:t>DML</w:t>
       </w:r>
       <w:r>
-        <w:t xml:space="preserve">, </w:t>
-      </w:r>
-      <w:r>
-        <w:t xml:space="preserve">а также прошёл полностью путь проектирования базы данных. </w:t>
+        <w:rPr>
+          <w:rFonts w:ascii="Times New Roman" w:hAnsi="Times New Roman" w:cs="Times New Roman"/>
+        </w:rPr>
+        <w:t xml:space="preserve">, а также прошёл полностью путь проектирования базы данных. </w:t>
       </w:r>
     </w:p>
     <w:sectPr>

</xml_diff>

<commit_message>
Fixed programming lab 6
</commit_message>
<xml_diff>
--- a/DB/Lab1/Лаба1.docx
+++ b/DB/Lab1/Лаба1.docx
@@ -578,7 +578,7 @@
           <w:r>
             <w:fldChar w:fldCharType="separate"/>
           </w:r>
-          <w:hyperlink w:anchor="_Toc224731232" w:history="1">
+          <w:hyperlink w:anchor="_Toc229390362" w:history="1">
             <w:r>
               <w:rPr>
                 <w:rStyle w:val="af0"/>
@@ -607,7 +607,7 @@
                 <w:noProof/>
                 <w:webHidden/>
               </w:rPr>
-              <w:instrText xml:space="preserve"> PAGEREF _Toc224731232 \h </w:instrText>
+              <w:instrText xml:space="preserve"> PAGEREF _Toc229390362 \h </w:instrText>
             </w:r>
             <w:r>
               <w:rPr>
@@ -650,7 +650,7 @@
               <w:lang w:eastAsia="ru-RU"/>
             </w:rPr>
           </w:pPr>
-          <w:hyperlink w:anchor="_Toc224731233" w:history="1">
+          <w:hyperlink w:anchor="_Toc229390363" w:history="1">
             <w:r>
               <w:rPr>
                 <w:rStyle w:val="af0"/>
@@ -679,7 +679,7 @@
                 <w:noProof/>
                 <w:webHidden/>
               </w:rPr>
-              <w:instrText xml:space="preserve"> PAGEREF _Toc224731233 \h </w:instrText>
+              <w:instrText xml:space="preserve"> PAGEREF _Toc229390363 \h </w:instrText>
             </w:r>
             <w:r>
               <w:rPr>
@@ -722,7 +722,7 @@
               <w:lang w:eastAsia="ru-RU"/>
             </w:rPr>
           </w:pPr>
-          <w:hyperlink w:anchor="_Toc224731234" w:history="1">
+          <w:hyperlink w:anchor="_Toc229390364" w:history="1">
             <w:r>
               <w:rPr>
                 <w:rStyle w:val="af0"/>
@@ -749,7 +749,7 @@
                 <w:noProof/>
                 <w:webHidden/>
               </w:rPr>
-              <w:instrText xml:space="preserve"> PAGEREF _Toc224731234 \h </w:instrText>
+              <w:instrText xml:space="preserve"> PAGEREF _Toc229390364 \h </w:instrText>
             </w:r>
             <w:r>
               <w:rPr>
@@ -792,13 +792,13 @@
               <w:lang w:eastAsia="ru-RU"/>
             </w:rPr>
           </w:pPr>
-          <w:hyperlink w:anchor="_Toc224731235" w:history="1">
+          <w:hyperlink w:anchor="_Toc229390365" w:history="1">
             <w:r>
               <w:rPr>
                 <w:rStyle w:val="af0"/>
                 <w:noProof/>
               </w:rPr>
-              <w:t>Инфологическая модель в нотации Чена</w:t>
+              <w:t>Инфологическая модель в нотации Мартина</w:t>
             </w:r>
             <w:r>
               <w:rPr>
@@ -819,7 +819,7 @@
                 <w:noProof/>
                 <w:webHidden/>
               </w:rPr>
-              <w:instrText xml:space="preserve"> PAGEREF _Toc224731235 \h </w:instrText>
+              <w:instrText xml:space="preserve"> PAGEREF _Toc229390365 \h </w:instrText>
             </w:r>
             <w:r>
               <w:rPr>
@@ -862,13 +862,13 @@
               <w:lang w:eastAsia="ru-RU"/>
             </w:rPr>
           </w:pPr>
-          <w:hyperlink w:anchor="_Toc224731236" w:history="1">
+          <w:hyperlink w:anchor="_Toc229390366" w:history="1">
             <w:r>
               <w:rPr>
                 <w:rStyle w:val="af0"/>
                 <w:noProof/>
               </w:rPr>
-              <w:t>Инфологическая модель в нотации Мартина</w:t>
+              <w:t>Даталогическая модель</w:t>
             </w:r>
             <w:r>
               <w:rPr>
@@ -889,7 +889,7 @@
                 <w:noProof/>
                 <w:webHidden/>
               </w:rPr>
-              <w:instrText xml:space="preserve"> PAGEREF _Toc224731236 \h </w:instrText>
+              <w:instrText xml:space="preserve"> PAGEREF _Toc229390366 \h </w:instrText>
             </w:r>
             <w:r>
               <w:rPr>
@@ -932,13 +932,21 @@
               <w:lang w:eastAsia="ru-RU"/>
             </w:rPr>
           </w:pPr>
-          <w:hyperlink w:anchor="_Toc224731237" w:history="1">
+          <w:hyperlink w:anchor="_Toc229390367" w:history="1">
             <w:r>
               <w:rPr>
                 <w:rStyle w:val="af0"/>
                 <w:noProof/>
               </w:rPr>
-              <w:t>Даталогическая модель</w:t>
+              <w:t xml:space="preserve">Реализация для </w:t>
+            </w:r>
+            <w:r>
+              <w:rPr>
+                <w:rStyle w:val="af0"/>
+                <w:noProof/>
+                <w:lang w:val="en-US"/>
+              </w:rPr>
+              <w:t>PostgreSQL</w:t>
             </w:r>
             <w:r>
               <w:rPr>
@@ -959,7 +967,7 @@
                 <w:noProof/>
                 <w:webHidden/>
               </w:rPr>
-              <w:instrText xml:space="preserve"> PAGEREF _Toc224731237 \h </w:instrText>
+              <w:instrText xml:space="preserve"> PAGEREF _Toc229390367 \h </w:instrText>
             </w:r>
             <w:r>
               <w:rPr>
@@ -991,6 +999,76 @@
           </w:hyperlink>
         </w:p>
         <w:p>
+          <w:pPr>
+            <w:pStyle w:val="11"/>
+            <w:tabs>
+              <w:tab w:val="right" w:leader="dot" w:pos="9344"/>
+            </w:tabs>
+            <w:rPr>
+              <w:rFonts w:eastAsiaTheme="minorEastAsia"/>
+              <w:noProof/>
+              <w:lang w:eastAsia="ru-RU"/>
+            </w:rPr>
+          </w:pPr>
+          <w:hyperlink w:anchor="_Toc229390368" w:history="1">
+            <w:r>
+              <w:rPr>
+                <w:rStyle w:val="af0"/>
+                <w:noProof/>
+              </w:rPr>
+              <w:t>Выводы</w:t>
+            </w:r>
+            <w:r>
+              <w:rPr>
+                <w:noProof/>
+                <w:webHidden/>
+              </w:rPr>
+              <w:tab/>
+            </w:r>
+            <w:r>
+              <w:rPr>
+                <w:noProof/>
+                <w:webHidden/>
+              </w:rPr>
+              <w:fldChar w:fldCharType="begin"/>
+            </w:r>
+            <w:r>
+              <w:rPr>
+                <w:noProof/>
+                <w:webHidden/>
+              </w:rPr>
+              <w:instrText xml:space="preserve"> PAGEREF _Toc229390368 \h </w:instrText>
+            </w:r>
+            <w:r>
+              <w:rPr>
+                <w:noProof/>
+                <w:webHidden/>
+              </w:rPr>
+            </w:r>
+            <w:r>
+              <w:rPr>
+                <w:noProof/>
+                <w:webHidden/>
+              </w:rPr>
+              <w:fldChar w:fldCharType="separate"/>
+            </w:r>
+            <w:r>
+              <w:rPr>
+                <w:noProof/>
+                <w:webHidden/>
+              </w:rPr>
+              <w:t>7</w:t>
+            </w:r>
+            <w:r>
+              <w:rPr>
+                <w:noProof/>
+                <w:webHidden/>
+              </w:rPr>
+              <w:fldChar w:fldCharType="end"/>
+            </w:r>
+          </w:hyperlink>
+        </w:p>
+        <w:p>
           <w:r>
             <w:rPr>
               <w:b/>
@@ -1025,7 +1103,7 @@
           <w:rStyle w:val="af4"/>
         </w:rPr>
       </w:pPr>
-      <w:bookmarkStart w:id="0" w:name="_Toc224731232"/>
+      <w:bookmarkStart w:id="0" w:name="_Toc229390362"/>
       <w:r>
         <w:rPr>
           <w:rStyle w:val="af4"/>
@@ -1293,7 +1371,7 @@
           <w:rStyle w:val="af4"/>
         </w:rPr>
       </w:pPr>
-      <w:bookmarkStart w:id="1" w:name="_Toc224731233"/>
+      <w:bookmarkStart w:id="1" w:name="_Toc229390363"/>
       <w:r>
         <w:rPr>
           <w:rStyle w:val="af4"/>
@@ -1612,7 +1690,7 @@
       <w:pPr>
         <w:pStyle w:val="a5"/>
       </w:pPr>
-      <w:bookmarkStart w:id="2" w:name="_Toc224731234"/>
+      <w:bookmarkStart w:id="2" w:name="_Toc229390364"/>
       <w:r>
         <w:t>Классификация сущностей</w:t>
       </w:r>
@@ -2516,7 +2594,7 @@
       <w:pPr>
         <w:pStyle w:val="a3"/>
       </w:pPr>
-      <w:bookmarkStart w:id="3" w:name="_Toc224731236"/>
+      <w:bookmarkStart w:id="3" w:name="_Toc229390365"/>
       <w:r>
         <w:lastRenderedPageBreak/>
         <w:t>Инфологическая модель</w:t>
@@ -2601,7 +2679,7 @@
       <w:pPr>
         <w:pStyle w:val="a3"/>
       </w:pPr>
-      <w:bookmarkStart w:id="4" w:name="_Toc224731237"/>
+      <w:bookmarkStart w:id="4" w:name="_Toc229390366"/>
       <w:r>
         <w:lastRenderedPageBreak/>
         <w:t>Даталогическая модель</w:t>
@@ -2685,6 +2763,7 @@
       <w:pPr>
         <w:pStyle w:val="a3"/>
       </w:pPr>
+      <w:bookmarkStart w:id="5" w:name="_Toc229390367"/>
       <w:r>
         <w:lastRenderedPageBreak/>
         <w:t xml:space="preserve">Реализация для </w:t>
@@ -2695,6 +2774,7 @@
         </w:rPr>
         <w:t>PostgreSQL</w:t>
       </w:r>
+      <w:bookmarkEnd w:id="5"/>
     </w:p>
     <w:p>
       <w:pPr>
@@ -2853,10 +2933,12 @@
       <w:pPr>
         <w:pStyle w:val="a3"/>
       </w:pPr>
+      <w:bookmarkStart w:id="6" w:name="_Toc229390368"/>
       <w:r>
         <w:lastRenderedPageBreak/>
         <w:t>Выводы</w:t>
       </w:r>
+      <w:bookmarkEnd w:id="6"/>
     </w:p>
     <w:p>
       <w:pPr>

</xml_diff>